<commit_message>
Updated data dictionary documentation.
</commit_message>
<xml_diff>
--- a/documentation/f1_data_dictionary.docx
+++ b/documentation/f1_data_dictionary.docx
@@ -49,12 +49,6 @@
         <w:gridCol w:w="3360"/>
       </w:tblGrid>
       <w:tr>
-        <w:tblPrEx>
-          <w:tblCellMar>
-            <w:top w:w="0" w:type="dxa"/>
-            <w:bottom w:w="0" w:type="dxa"/>
-          </w:tblCellMar>
-        </w:tblPrEx>
         <w:trPr>
           <w:tblHeader/>
         </w:trPr>
@@ -124,12 +118,6 @@
         </w:tc>
       </w:tr>
       <w:tr>
-        <w:tblPrEx>
-          <w:tblCellMar>
-            <w:top w:w="0" w:type="dxa"/>
-            <w:bottom w:w="0" w:type="dxa"/>
-          </w:tblCellMar>
-        </w:tblPrEx>
         <w:tc>
           <w:tcPr>
             <w:tcW w:w="2400" w:type="dxa"/>
@@ -172,12 +160,6 @@
         </w:tc>
       </w:tr>
       <w:tr>
-        <w:tblPrEx>
-          <w:tblCellMar>
-            <w:top w:w="0" w:type="dxa"/>
-            <w:bottom w:w="0" w:type="dxa"/>
-          </w:tblCellMar>
-        </w:tblPrEx>
         <w:tc>
           <w:tcPr>
             <w:tcW w:w="2400" w:type="dxa"/>
@@ -218,12 +200,6 @@
         </w:tc>
       </w:tr>
       <w:tr>
-        <w:tblPrEx>
-          <w:tblCellMar>
-            <w:top w:w="0" w:type="dxa"/>
-            <w:bottom w:w="0" w:type="dxa"/>
-          </w:tblCellMar>
-        </w:tblPrEx>
         <w:tc>
           <w:tcPr>
             <w:tcW w:w="2400" w:type="dxa"/>
@@ -258,12 +234,6 @@
         </w:tc>
       </w:tr>
       <w:tr>
-        <w:tblPrEx>
-          <w:tblCellMar>
-            <w:top w:w="0" w:type="dxa"/>
-            <w:bottom w:w="0" w:type="dxa"/>
-          </w:tblCellMar>
-        </w:tblPrEx>
         <w:tc>
           <w:tcPr>
             <w:tcW w:w="2400" w:type="dxa"/>
@@ -302,12 +272,6 @@
         </w:tc>
       </w:tr>
       <w:tr>
-        <w:tblPrEx>
-          <w:tblCellMar>
-            <w:top w:w="0" w:type="dxa"/>
-            <w:bottom w:w="0" w:type="dxa"/>
-          </w:tblCellMar>
-        </w:tblPrEx>
         <w:tc>
           <w:tcPr>
             <w:tcW w:w="2400" w:type="dxa"/>
@@ -342,12 +306,6 @@
         </w:tc>
       </w:tr>
       <w:tr>
-        <w:tblPrEx>
-          <w:tblCellMar>
-            <w:top w:w="0" w:type="dxa"/>
-            <w:bottom w:w="0" w:type="dxa"/>
-          </w:tblCellMar>
-        </w:tblPrEx>
         <w:tc>
           <w:tcPr>
             <w:tcW w:w="2400" w:type="dxa"/>
@@ -388,12 +346,6 @@
         </w:tc>
       </w:tr>
       <w:tr>
-        <w:tblPrEx>
-          <w:tblCellMar>
-            <w:top w:w="0" w:type="dxa"/>
-            <w:bottom w:w="0" w:type="dxa"/>
-          </w:tblCellMar>
-        </w:tblPrEx>
         <w:tc>
           <w:tcPr>
             <w:tcW w:w="2400" w:type="dxa"/>
@@ -430,12 +382,6 @@
         </w:tc>
       </w:tr>
       <w:tr>
-        <w:tblPrEx>
-          <w:tblCellMar>
-            <w:top w:w="0" w:type="dxa"/>
-            <w:bottom w:w="0" w:type="dxa"/>
-          </w:tblCellMar>
-        </w:tblPrEx>
         <w:tc>
           <w:tcPr>
             <w:tcW w:w="2400" w:type="dxa"/>
@@ -480,12 +426,6 @@
         </w:tc>
       </w:tr>
       <w:tr>
-        <w:tblPrEx>
-          <w:tblCellMar>
-            <w:top w:w="0" w:type="dxa"/>
-            <w:bottom w:w="0" w:type="dxa"/>
-          </w:tblCellMar>
-        </w:tblPrEx>
         <w:tc>
           <w:tcPr>
             <w:tcW w:w="2400" w:type="dxa"/>
@@ -560,12 +500,6 @@
         <w:gridCol w:w="3360"/>
       </w:tblGrid>
       <w:tr>
-        <w:tblPrEx>
-          <w:tblCellMar>
-            <w:top w:w="0" w:type="dxa"/>
-            <w:bottom w:w="0" w:type="dxa"/>
-          </w:tblCellMar>
-        </w:tblPrEx>
         <w:trPr>
           <w:tblHeader/>
         </w:trPr>
@@ -635,12 +569,6 @@
         </w:tc>
       </w:tr>
       <w:tr>
-        <w:tblPrEx>
-          <w:tblCellMar>
-            <w:top w:w="0" w:type="dxa"/>
-            <w:bottom w:w="0" w:type="dxa"/>
-          </w:tblCellMar>
-        </w:tblPrEx>
         <w:tc>
           <w:tcPr>
             <w:tcW w:w="2400" w:type="dxa"/>
@@ -683,12 +611,6 @@
         </w:tc>
       </w:tr>
       <w:tr>
-        <w:tblPrEx>
-          <w:tblCellMar>
-            <w:top w:w="0" w:type="dxa"/>
-            <w:bottom w:w="0" w:type="dxa"/>
-          </w:tblCellMar>
-        </w:tblPrEx>
         <w:tc>
           <w:tcPr>
             <w:tcW w:w="2400" w:type="dxa"/>
@@ -729,12 +651,6 @@
         </w:tc>
       </w:tr>
       <w:tr>
-        <w:tblPrEx>
-          <w:tblCellMar>
-            <w:top w:w="0" w:type="dxa"/>
-            <w:bottom w:w="0" w:type="dxa"/>
-          </w:tblCellMar>
-        </w:tblPrEx>
         <w:tc>
           <w:tcPr>
             <w:tcW w:w="2400" w:type="dxa"/>
@@ -769,12 +685,6 @@
         </w:tc>
       </w:tr>
       <w:tr>
-        <w:tblPrEx>
-          <w:tblCellMar>
-            <w:top w:w="0" w:type="dxa"/>
-            <w:bottom w:w="0" w:type="dxa"/>
-          </w:tblCellMar>
-        </w:tblPrEx>
         <w:tc>
           <w:tcPr>
             <w:tcW w:w="2400" w:type="dxa"/>
@@ -813,12 +723,6 @@
         </w:tc>
       </w:tr>
       <w:tr>
-        <w:tblPrEx>
-          <w:tblCellMar>
-            <w:top w:w="0" w:type="dxa"/>
-            <w:bottom w:w="0" w:type="dxa"/>
-          </w:tblCellMar>
-        </w:tblPrEx>
         <w:tc>
           <w:tcPr>
             <w:tcW w:w="2400" w:type="dxa"/>
@@ -895,12 +799,6 @@
         <w:gridCol w:w="3360"/>
       </w:tblGrid>
       <w:tr>
-        <w:tblPrEx>
-          <w:tblCellMar>
-            <w:top w:w="0" w:type="dxa"/>
-            <w:bottom w:w="0" w:type="dxa"/>
-          </w:tblCellMar>
-        </w:tblPrEx>
         <w:trPr>
           <w:tblHeader/>
         </w:trPr>
@@ -970,12 +868,6 @@
         </w:tc>
       </w:tr>
       <w:tr>
-        <w:tblPrEx>
-          <w:tblCellMar>
-            <w:top w:w="0" w:type="dxa"/>
-            <w:bottom w:w="0" w:type="dxa"/>
-          </w:tblCellMar>
-        </w:tblPrEx>
         <w:tc>
           <w:tcPr>
             <w:tcW w:w="2400" w:type="dxa"/>
@@ -1018,12 +910,6 @@
         </w:tc>
       </w:tr>
       <w:tr>
-        <w:tblPrEx>
-          <w:tblCellMar>
-            <w:top w:w="0" w:type="dxa"/>
-            <w:bottom w:w="0" w:type="dxa"/>
-          </w:tblCellMar>
-        </w:tblPrEx>
         <w:tc>
           <w:tcPr>
             <w:tcW w:w="2400" w:type="dxa"/>
@@ -1074,12 +960,6 @@
         </w:tc>
       </w:tr>
       <w:tr>
-        <w:tblPrEx>
-          <w:tblCellMar>
-            <w:top w:w="0" w:type="dxa"/>
-            <w:bottom w:w="0" w:type="dxa"/>
-          </w:tblCellMar>
-        </w:tblPrEx>
         <w:tc>
           <w:tcPr>
             <w:tcW w:w="2400" w:type="dxa"/>
@@ -1126,12 +1006,6 @@
         </w:tc>
       </w:tr>
       <w:tr>
-        <w:tblPrEx>
-          <w:tblCellMar>
-            <w:top w:w="0" w:type="dxa"/>
-            <w:bottom w:w="0" w:type="dxa"/>
-          </w:tblCellMar>
-        </w:tblPrEx>
         <w:tc>
           <w:tcPr>
             <w:tcW w:w="2400" w:type="dxa"/>
@@ -1170,12 +1044,6 @@
         </w:tc>
       </w:tr>
       <w:tr>
-        <w:tblPrEx>
-          <w:tblCellMar>
-            <w:top w:w="0" w:type="dxa"/>
-            <w:bottom w:w="0" w:type="dxa"/>
-          </w:tblCellMar>
-        </w:tblPrEx>
         <w:tc>
           <w:tcPr>
             <w:tcW w:w="2400" w:type="dxa"/>
@@ -1250,12 +1118,6 @@
         <w:gridCol w:w="3360"/>
       </w:tblGrid>
       <w:tr>
-        <w:tblPrEx>
-          <w:tblCellMar>
-            <w:top w:w="0" w:type="dxa"/>
-            <w:bottom w:w="0" w:type="dxa"/>
-          </w:tblCellMar>
-        </w:tblPrEx>
         <w:trPr>
           <w:tblHeader/>
         </w:trPr>
@@ -1325,12 +1187,6 @@
         </w:tc>
       </w:tr>
       <w:tr>
-        <w:tblPrEx>
-          <w:tblCellMar>
-            <w:top w:w="0" w:type="dxa"/>
-            <w:bottom w:w="0" w:type="dxa"/>
-          </w:tblCellMar>
-        </w:tblPrEx>
         <w:tc>
           <w:tcPr>
             <w:tcW w:w="2400" w:type="dxa"/>
@@ -1373,12 +1229,6 @@
         </w:tc>
       </w:tr>
       <w:tr>
-        <w:tblPrEx>
-          <w:tblCellMar>
-            <w:top w:w="0" w:type="dxa"/>
-            <w:bottom w:w="0" w:type="dxa"/>
-          </w:tblCellMar>
-        </w:tblPrEx>
         <w:tc>
           <w:tcPr>
             <w:tcW w:w="2400" w:type="dxa"/>
@@ -1429,12 +1279,6 @@
         </w:tc>
       </w:tr>
       <w:tr>
-        <w:tblPrEx>
-          <w:tblCellMar>
-            <w:top w:w="0" w:type="dxa"/>
-            <w:bottom w:w="0" w:type="dxa"/>
-          </w:tblCellMar>
-        </w:tblPrEx>
         <w:tc>
           <w:tcPr>
             <w:tcW w:w="2400" w:type="dxa"/>
@@ -1481,12 +1325,6 @@
         </w:tc>
       </w:tr>
       <w:tr>
-        <w:tblPrEx>
-          <w:tblCellMar>
-            <w:top w:w="0" w:type="dxa"/>
-            <w:bottom w:w="0" w:type="dxa"/>
-          </w:tblCellMar>
-        </w:tblPrEx>
         <w:tc>
           <w:tcPr>
             <w:tcW w:w="2400" w:type="dxa"/>
@@ -1525,12 +1363,6 @@
         </w:tc>
       </w:tr>
       <w:tr>
-        <w:tblPrEx>
-          <w:tblCellMar>
-            <w:top w:w="0" w:type="dxa"/>
-            <w:bottom w:w="0" w:type="dxa"/>
-          </w:tblCellMar>
-        </w:tblPrEx>
         <w:tc>
           <w:tcPr>
             <w:tcW w:w="2400" w:type="dxa"/>
@@ -1565,12 +1397,6 @@
         </w:tc>
       </w:tr>
       <w:tr>
-        <w:tblPrEx>
-          <w:tblCellMar>
-            <w:top w:w="0" w:type="dxa"/>
-            <w:bottom w:w="0" w:type="dxa"/>
-          </w:tblCellMar>
-        </w:tblPrEx>
         <w:tc>
           <w:tcPr>
             <w:tcW w:w="2400" w:type="dxa"/>
@@ -1611,12 +1437,6 @@
         </w:tc>
       </w:tr>
       <w:tr>
-        <w:tblPrEx>
-          <w:tblCellMar>
-            <w:top w:w="0" w:type="dxa"/>
-            <w:bottom w:w="0" w:type="dxa"/>
-          </w:tblCellMar>
-        </w:tblPrEx>
         <w:tc>
           <w:tcPr>
             <w:tcW w:w="2400" w:type="dxa"/>
@@ -1704,12 +1524,6 @@
         <w:gridCol w:w="3360"/>
       </w:tblGrid>
       <w:tr>
-        <w:tblPrEx>
-          <w:tblCellMar>
-            <w:top w:w="0" w:type="dxa"/>
-            <w:bottom w:w="0" w:type="dxa"/>
-          </w:tblCellMar>
-        </w:tblPrEx>
         <w:trPr>
           <w:tblHeader/>
         </w:trPr>
@@ -1779,12 +1593,6 @@
         </w:tc>
       </w:tr>
       <w:tr>
-        <w:tblPrEx>
-          <w:tblCellMar>
-            <w:top w:w="0" w:type="dxa"/>
-            <w:bottom w:w="0" w:type="dxa"/>
-          </w:tblCellMar>
-        </w:tblPrEx>
         <w:tc>
           <w:tcPr>
             <w:tcW w:w="2400" w:type="dxa"/>
@@ -1827,12 +1635,6 @@
         </w:tc>
       </w:tr>
       <w:tr>
-        <w:tblPrEx>
-          <w:tblCellMar>
-            <w:top w:w="0" w:type="dxa"/>
-            <w:bottom w:w="0" w:type="dxa"/>
-          </w:tblCellMar>
-        </w:tblPrEx>
         <w:tc>
           <w:tcPr>
             <w:tcW w:w="2400" w:type="dxa"/>
@@ -1873,12 +1675,6 @@
         </w:tc>
       </w:tr>
       <w:tr>
-        <w:tblPrEx>
-          <w:tblCellMar>
-            <w:top w:w="0" w:type="dxa"/>
-            <w:bottom w:w="0" w:type="dxa"/>
-          </w:tblCellMar>
-        </w:tblPrEx>
         <w:tc>
           <w:tcPr>
             <w:tcW w:w="2400" w:type="dxa"/>
@@ -1913,12 +1709,6 @@
         </w:tc>
       </w:tr>
       <w:tr>
-        <w:tblPrEx>
-          <w:tblCellMar>
-            <w:top w:w="0" w:type="dxa"/>
-            <w:bottom w:w="0" w:type="dxa"/>
-          </w:tblCellMar>
-        </w:tblPrEx>
         <w:tc>
           <w:tcPr>
             <w:tcW w:w="2400" w:type="dxa"/>
@@ -1957,12 +1747,6 @@
         </w:tc>
       </w:tr>
       <w:tr>
-        <w:tblPrEx>
-          <w:tblCellMar>
-            <w:top w:w="0" w:type="dxa"/>
-            <w:bottom w:w="0" w:type="dxa"/>
-          </w:tblCellMar>
-        </w:tblPrEx>
         <w:tc>
           <w:tcPr>
             <w:tcW w:w="2400" w:type="dxa"/>
@@ -1997,12 +1781,6 @@
         </w:tc>
       </w:tr>
       <w:tr>
-        <w:tblPrEx>
-          <w:tblCellMar>
-            <w:top w:w="0" w:type="dxa"/>
-            <w:bottom w:w="0" w:type="dxa"/>
-          </w:tblCellMar>
-        </w:tblPrEx>
         <w:tc>
           <w:tcPr>
             <w:tcW w:w="2400" w:type="dxa"/>
@@ -2041,12 +1819,6 @@
         </w:tc>
       </w:tr>
       <w:tr>
-        <w:tblPrEx>
-          <w:tblCellMar>
-            <w:top w:w="0" w:type="dxa"/>
-            <w:bottom w:w="0" w:type="dxa"/>
-          </w:tblCellMar>
-        </w:tblPrEx>
         <w:tc>
           <w:tcPr>
             <w:tcW w:w="2400" w:type="dxa"/>
@@ -2085,12 +1857,6 @@
         </w:tc>
       </w:tr>
       <w:tr>
-        <w:tblPrEx>
-          <w:tblCellMar>
-            <w:top w:w="0" w:type="dxa"/>
-            <w:bottom w:w="0" w:type="dxa"/>
-          </w:tblCellMar>
-        </w:tblPrEx>
         <w:tc>
           <w:tcPr>
             <w:tcW w:w="2400" w:type="dxa"/>
@@ -2129,12 +1895,6 @@
         </w:tc>
       </w:tr>
       <w:tr>
-        <w:tblPrEx>
-          <w:tblCellMar>
-            <w:top w:w="0" w:type="dxa"/>
-            <w:bottom w:w="0" w:type="dxa"/>
-          </w:tblCellMar>
-        </w:tblPrEx>
         <w:tc>
           <w:tcPr>
             <w:tcW w:w="2400" w:type="dxa"/>
@@ -2211,12 +1971,6 @@
         <w:gridCol w:w="3360"/>
       </w:tblGrid>
       <w:tr>
-        <w:tblPrEx>
-          <w:tblCellMar>
-            <w:top w:w="0" w:type="dxa"/>
-            <w:bottom w:w="0" w:type="dxa"/>
-          </w:tblCellMar>
-        </w:tblPrEx>
         <w:trPr>
           <w:tblHeader/>
         </w:trPr>
@@ -2286,12 +2040,6 @@
         </w:tc>
       </w:tr>
       <w:tr>
-        <w:tblPrEx>
-          <w:tblCellMar>
-            <w:top w:w="0" w:type="dxa"/>
-            <w:bottom w:w="0" w:type="dxa"/>
-          </w:tblCellMar>
-        </w:tblPrEx>
         <w:tc>
           <w:tcPr>
             <w:tcW w:w="2400" w:type="dxa"/>
@@ -2334,12 +2082,6 @@
         </w:tc>
       </w:tr>
       <w:tr>
-        <w:tblPrEx>
-          <w:tblCellMar>
-            <w:top w:w="0" w:type="dxa"/>
-            <w:bottom w:w="0" w:type="dxa"/>
-          </w:tblCellMar>
-        </w:tblPrEx>
         <w:tc>
           <w:tcPr>
             <w:tcW w:w="2400" w:type="dxa"/>
@@ -2390,12 +2132,6 @@
         </w:tc>
       </w:tr>
       <w:tr>
-        <w:tblPrEx>
-          <w:tblCellMar>
-            <w:top w:w="0" w:type="dxa"/>
-            <w:bottom w:w="0" w:type="dxa"/>
-          </w:tblCellMar>
-        </w:tblPrEx>
         <w:tc>
           <w:tcPr>
             <w:tcW w:w="2400" w:type="dxa"/>
@@ -2442,12 +2178,6 @@
         </w:tc>
       </w:tr>
       <w:tr>
-        <w:tblPrEx>
-          <w:tblCellMar>
-            <w:top w:w="0" w:type="dxa"/>
-            <w:bottom w:w="0" w:type="dxa"/>
-          </w:tblCellMar>
-        </w:tblPrEx>
         <w:tc>
           <w:tcPr>
             <w:tcW w:w="2400" w:type="dxa"/>
@@ -2486,12 +2216,6 @@
         </w:tc>
       </w:tr>
       <w:tr>
-        <w:tblPrEx>
-          <w:tblCellMar>
-            <w:top w:w="0" w:type="dxa"/>
-            <w:bottom w:w="0" w:type="dxa"/>
-          </w:tblCellMar>
-        </w:tblPrEx>
         <w:tc>
           <w:tcPr>
             <w:tcW w:w="2400" w:type="dxa"/>
@@ -2526,12 +2250,6 @@
         </w:tc>
       </w:tr>
       <w:tr>
-        <w:tblPrEx>
-          <w:tblCellMar>
-            <w:top w:w="0" w:type="dxa"/>
-            <w:bottom w:w="0" w:type="dxa"/>
-          </w:tblCellMar>
-        </w:tblPrEx>
         <w:tc>
           <w:tcPr>
             <w:tcW w:w="2400" w:type="dxa"/>
@@ -2572,12 +2290,6 @@
         </w:tc>
       </w:tr>
       <w:tr>
-        <w:tblPrEx>
-          <w:tblCellMar>
-            <w:top w:w="0" w:type="dxa"/>
-            <w:bottom w:w="0" w:type="dxa"/>
-          </w:tblCellMar>
-        </w:tblPrEx>
         <w:tc>
           <w:tcPr>
             <w:tcW w:w="2400" w:type="dxa"/>
@@ -2654,12 +2366,6 @@
         <w:gridCol w:w="3360"/>
       </w:tblGrid>
       <w:tr>
-        <w:tblPrEx>
-          <w:tblCellMar>
-            <w:top w:w="0" w:type="dxa"/>
-            <w:bottom w:w="0" w:type="dxa"/>
-          </w:tblCellMar>
-        </w:tblPrEx>
         <w:trPr>
           <w:tblHeader/>
         </w:trPr>
@@ -2729,12 +2435,6 @@
         </w:tc>
       </w:tr>
       <w:tr>
-        <w:tblPrEx>
-          <w:tblCellMar>
-            <w:top w:w="0" w:type="dxa"/>
-            <w:bottom w:w="0" w:type="dxa"/>
-          </w:tblCellMar>
-        </w:tblPrEx>
         <w:tc>
           <w:tcPr>
             <w:tcW w:w="2400" w:type="dxa"/>
@@ -2789,12 +2489,6 @@
         </w:tc>
       </w:tr>
       <w:tr>
-        <w:tblPrEx>
-          <w:tblCellMar>
-            <w:top w:w="0" w:type="dxa"/>
-            <w:bottom w:w="0" w:type="dxa"/>
-          </w:tblCellMar>
-        </w:tblPrEx>
         <w:tc>
           <w:tcPr>
             <w:tcW w:w="2400" w:type="dxa"/>
@@ -2845,12 +2539,6 @@
         </w:tc>
       </w:tr>
       <w:tr>
-        <w:tblPrEx>
-          <w:tblCellMar>
-            <w:top w:w="0" w:type="dxa"/>
-            <w:bottom w:w="0" w:type="dxa"/>
-          </w:tblCellMar>
-        </w:tblPrEx>
         <w:tc>
           <w:tcPr>
             <w:tcW w:w="2400" w:type="dxa"/>
@@ -2891,12 +2579,6 @@
         </w:tc>
       </w:tr>
       <w:tr>
-        <w:tblPrEx>
-          <w:tblCellMar>
-            <w:top w:w="0" w:type="dxa"/>
-            <w:bottom w:w="0" w:type="dxa"/>
-          </w:tblCellMar>
-        </w:tblPrEx>
         <w:tc>
           <w:tcPr>
             <w:tcW w:w="2400" w:type="dxa"/>
@@ -2937,12 +2619,6 @@
         </w:tc>
       </w:tr>
       <w:tr>
-        <w:tblPrEx>
-          <w:tblCellMar>
-            <w:top w:w="0" w:type="dxa"/>
-            <w:bottom w:w="0" w:type="dxa"/>
-          </w:tblCellMar>
-        </w:tblPrEx>
         <w:tc>
           <w:tcPr>
             <w:tcW w:w="2400" w:type="dxa"/>
@@ -2981,12 +2657,6 @@
         </w:tc>
       </w:tr>
       <w:tr>
-        <w:tblPrEx>
-          <w:tblCellMar>
-            <w:top w:w="0" w:type="dxa"/>
-            <w:bottom w:w="0" w:type="dxa"/>
-          </w:tblCellMar>
-        </w:tblPrEx>
         <w:tc>
           <w:tcPr>
             <w:tcW w:w="2400" w:type="dxa"/>
@@ -3067,12 +2737,6 @@
         <w:gridCol w:w="3360"/>
       </w:tblGrid>
       <w:tr>
-        <w:tblPrEx>
-          <w:tblCellMar>
-            <w:top w:w="0" w:type="dxa"/>
-            <w:bottom w:w="0" w:type="dxa"/>
-          </w:tblCellMar>
-        </w:tblPrEx>
         <w:trPr>
           <w:tblHeader/>
         </w:trPr>
@@ -3142,12 +2806,6 @@
         </w:tc>
       </w:tr>
       <w:tr>
-        <w:tblPrEx>
-          <w:tblCellMar>
-            <w:top w:w="0" w:type="dxa"/>
-            <w:bottom w:w="0" w:type="dxa"/>
-          </w:tblCellMar>
-        </w:tblPrEx>
         <w:tc>
           <w:tcPr>
             <w:tcW w:w="2400" w:type="dxa"/>
@@ -3202,12 +2860,6 @@
         </w:tc>
       </w:tr>
       <w:tr>
-        <w:tblPrEx>
-          <w:tblCellMar>
-            <w:top w:w="0" w:type="dxa"/>
-            <w:bottom w:w="0" w:type="dxa"/>
-          </w:tblCellMar>
-        </w:tblPrEx>
         <w:tc>
           <w:tcPr>
             <w:tcW w:w="2400" w:type="dxa"/>
@@ -3258,12 +2910,6 @@
         </w:tc>
       </w:tr>
       <w:tr>
-        <w:tblPrEx>
-          <w:tblCellMar>
-            <w:top w:w="0" w:type="dxa"/>
-            <w:bottom w:w="0" w:type="dxa"/>
-          </w:tblCellMar>
-        </w:tblPrEx>
         <w:tc>
           <w:tcPr>
             <w:tcW w:w="2400" w:type="dxa"/>
@@ -3308,12 +2954,6 @@
         </w:tc>
       </w:tr>
       <w:tr>
-        <w:tblPrEx>
-          <w:tblCellMar>
-            <w:top w:w="0" w:type="dxa"/>
-            <w:bottom w:w="0" w:type="dxa"/>
-          </w:tblCellMar>
-        </w:tblPrEx>
         <w:tc>
           <w:tcPr>
             <w:tcW w:w="2400" w:type="dxa"/>
@@ -3354,12 +2994,6 @@
         </w:tc>
       </w:tr>
       <w:tr>
-        <w:tblPrEx>
-          <w:tblCellMar>
-            <w:top w:w="0" w:type="dxa"/>
-            <w:bottom w:w="0" w:type="dxa"/>
-          </w:tblCellMar>
-        </w:tblPrEx>
         <w:tc>
           <w:tcPr>
             <w:tcW w:w="2400" w:type="dxa"/>
@@ -3394,12 +3028,6 @@
         </w:tc>
       </w:tr>
       <w:tr>
-        <w:tblPrEx>
-          <w:tblCellMar>
-            <w:top w:w="0" w:type="dxa"/>
-            <w:bottom w:w="0" w:type="dxa"/>
-          </w:tblCellMar>
-        </w:tblPrEx>
         <w:tc>
           <w:tcPr>
             <w:tcW w:w="2400" w:type="dxa"/>
@@ -3442,12 +3070,6 @@
         </w:tc>
       </w:tr>
       <w:tr>
-        <w:tblPrEx>
-          <w:tblCellMar>
-            <w:top w:w="0" w:type="dxa"/>
-            <w:bottom w:w="0" w:type="dxa"/>
-          </w:tblCellMar>
-        </w:tblPrEx>
         <w:tc>
           <w:tcPr>
             <w:tcW w:w="2400" w:type="dxa"/>
@@ -3533,12 +3155,6 @@
         <w:gridCol w:w="3360"/>
       </w:tblGrid>
       <w:tr>
-        <w:tblPrEx>
-          <w:tblCellMar>
-            <w:top w:w="0" w:type="dxa"/>
-            <w:bottom w:w="0" w:type="dxa"/>
-          </w:tblCellMar>
-        </w:tblPrEx>
         <w:trPr>
           <w:tblHeader/>
         </w:trPr>
@@ -3608,12 +3224,6 @@
         </w:tc>
       </w:tr>
       <w:tr>
-        <w:tblPrEx>
-          <w:tblCellMar>
-            <w:top w:w="0" w:type="dxa"/>
-            <w:bottom w:w="0" w:type="dxa"/>
-          </w:tblCellMar>
-        </w:tblPrEx>
         <w:tc>
           <w:tcPr>
             <w:tcW w:w="2400" w:type="dxa"/>
@@ -3656,12 +3266,6 @@
         </w:tc>
       </w:tr>
       <w:tr>
-        <w:tblPrEx>
-          <w:tblCellMar>
-            <w:top w:w="0" w:type="dxa"/>
-            <w:bottom w:w="0" w:type="dxa"/>
-          </w:tblCellMar>
-        </w:tblPrEx>
         <w:tc>
           <w:tcPr>
             <w:tcW w:w="2400" w:type="dxa"/>
@@ -3712,12 +3316,6 @@
         </w:tc>
       </w:tr>
       <w:tr>
-        <w:tblPrEx>
-          <w:tblCellMar>
-            <w:top w:w="0" w:type="dxa"/>
-            <w:bottom w:w="0" w:type="dxa"/>
-          </w:tblCellMar>
-        </w:tblPrEx>
         <w:tc>
           <w:tcPr>
             <w:tcW w:w="2400" w:type="dxa"/>
@@ -3764,12 +3362,6 @@
         </w:tc>
       </w:tr>
       <w:tr>
-        <w:tblPrEx>
-          <w:tblCellMar>
-            <w:top w:w="0" w:type="dxa"/>
-            <w:bottom w:w="0" w:type="dxa"/>
-          </w:tblCellMar>
-        </w:tblPrEx>
         <w:tc>
           <w:tcPr>
             <w:tcW w:w="2400" w:type="dxa"/>
@@ -3820,12 +3412,6 @@
         </w:tc>
       </w:tr>
       <w:tr>
-        <w:tblPrEx>
-          <w:tblCellMar>
-            <w:top w:w="0" w:type="dxa"/>
-            <w:bottom w:w="0" w:type="dxa"/>
-          </w:tblCellMar>
-        </w:tblPrEx>
         <w:tc>
           <w:tcPr>
             <w:tcW w:w="2400" w:type="dxa"/>
@@ -3862,12 +3448,6 @@
         </w:tc>
       </w:tr>
       <w:tr>
-        <w:tblPrEx>
-          <w:tblCellMar>
-            <w:top w:w="0" w:type="dxa"/>
-            <w:bottom w:w="0" w:type="dxa"/>
-          </w:tblCellMar>
-        </w:tblPrEx>
         <w:tc>
           <w:tcPr>
             <w:tcW w:w="2400" w:type="dxa"/>
@@ -3908,12 +3488,6 @@
         </w:tc>
       </w:tr>
       <w:tr>
-        <w:tblPrEx>
-          <w:tblCellMar>
-            <w:top w:w="0" w:type="dxa"/>
-            <w:bottom w:w="0" w:type="dxa"/>
-          </w:tblCellMar>
-        </w:tblPrEx>
         <w:tc>
           <w:tcPr>
             <w:tcW w:w="2400" w:type="dxa"/>
@@ -3952,12 +3526,6 @@
         </w:tc>
       </w:tr>
       <w:tr>
-        <w:tblPrEx>
-          <w:tblCellMar>
-            <w:top w:w="0" w:type="dxa"/>
-            <w:bottom w:w="0" w:type="dxa"/>
-          </w:tblCellMar>
-        </w:tblPrEx>
         <w:tc>
           <w:tcPr>
             <w:tcW w:w="2400" w:type="dxa"/>
@@ -4000,12 +3568,6 @@
         </w:tc>
       </w:tr>
       <w:tr>
-        <w:tblPrEx>
-          <w:tblCellMar>
-            <w:top w:w="0" w:type="dxa"/>
-            <w:bottom w:w="0" w:type="dxa"/>
-          </w:tblCellMar>
-        </w:tblPrEx>
         <w:tc>
           <w:tcPr>
             <w:tcW w:w="2400" w:type="dxa"/>
@@ -4090,12 +3652,6 @@
         <w:gridCol w:w="3360"/>
       </w:tblGrid>
       <w:tr>
-        <w:tblPrEx>
-          <w:tblCellMar>
-            <w:top w:w="0" w:type="dxa"/>
-            <w:bottom w:w="0" w:type="dxa"/>
-          </w:tblCellMar>
-        </w:tblPrEx>
         <w:trPr>
           <w:tblHeader/>
         </w:trPr>
@@ -4165,12 +3721,6 @@
         </w:tc>
       </w:tr>
       <w:tr>
-        <w:tblPrEx>
-          <w:tblCellMar>
-            <w:top w:w="0" w:type="dxa"/>
-            <w:bottom w:w="0" w:type="dxa"/>
-          </w:tblCellMar>
-        </w:tblPrEx>
         <w:tc>
           <w:tcPr>
             <w:tcW w:w="2400" w:type="dxa"/>
@@ -4213,12 +3763,6 @@
         </w:tc>
       </w:tr>
       <w:tr>
-        <w:tblPrEx>
-          <w:tblCellMar>
-            <w:top w:w="0" w:type="dxa"/>
-            <w:bottom w:w="0" w:type="dxa"/>
-          </w:tblCellMar>
-        </w:tblPrEx>
         <w:tc>
           <w:tcPr>
             <w:tcW w:w="2400" w:type="dxa"/>
@@ -4259,12 +3803,6 @@
         </w:tc>
       </w:tr>
       <w:tr>
-        <w:tblPrEx>
-          <w:tblCellMar>
-            <w:top w:w="0" w:type="dxa"/>
-            <w:bottom w:w="0" w:type="dxa"/>
-          </w:tblCellMar>
-        </w:tblPrEx>
         <w:tc>
           <w:tcPr>
             <w:tcW w:w="2400" w:type="dxa"/>
@@ -4301,12 +3839,6 @@
         </w:tc>
       </w:tr>
       <w:tr>
-        <w:tblPrEx>
-          <w:tblCellMar>
-            <w:top w:w="0" w:type="dxa"/>
-            <w:bottom w:w="0" w:type="dxa"/>
-          </w:tblCellMar>
-        </w:tblPrEx>
         <w:tc>
           <w:tcPr>
             <w:tcW w:w="2400" w:type="dxa"/>
@@ -4357,12 +3889,6 @@
         </w:tc>
       </w:tr>
       <w:tr>
-        <w:tblPrEx>
-          <w:tblCellMar>
-            <w:top w:w="0" w:type="dxa"/>
-            <w:bottom w:w="0" w:type="dxa"/>
-          </w:tblCellMar>
-        </w:tblPrEx>
         <w:tc>
           <w:tcPr>
             <w:tcW w:w="2400" w:type="dxa"/>
@@ -4397,12 +3923,6 @@
         </w:tc>
       </w:tr>
       <w:tr>
-        <w:tblPrEx>
-          <w:tblCellMar>
-            <w:top w:w="0" w:type="dxa"/>
-            <w:bottom w:w="0" w:type="dxa"/>
-          </w:tblCellMar>
-        </w:tblPrEx>
         <w:tc>
           <w:tcPr>
             <w:tcW w:w="2400" w:type="dxa"/>
@@ -4441,12 +3961,6 @@
         </w:tc>
       </w:tr>
       <w:tr>
-        <w:tblPrEx>
-          <w:tblCellMar>
-            <w:top w:w="0" w:type="dxa"/>
-            <w:bottom w:w="0" w:type="dxa"/>
-          </w:tblCellMar>
-        </w:tblPrEx>
         <w:tc>
           <w:tcPr>
             <w:tcW w:w="2400" w:type="dxa"/>
@@ -4481,12 +3995,6 @@
         </w:tc>
       </w:tr>
       <w:tr>
-        <w:tblPrEx>
-          <w:tblCellMar>
-            <w:top w:w="0" w:type="dxa"/>
-            <w:bottom w:w="0" w:type="dxa"/>
-          </w:tblCellMar>
-        </w:tblPrEx>
         <w:tc>
           <w:tcPr>
             <w:tcW w:w="2400" w:type="dxa"/>
@@ -4527,12 +4035,6 @@
         </w:tc>
       </w:tr>
       <w:tr>
-        <w:tblPrEx>
-          <w:tblCellMar>
-            <w:top w:w="0" w:type="dxa"/>
-            <w:bottom w:w="0" w:type="dxa"/>
-          </w:tblCellMar>
-        </w:tblPrEx>
         <w:tc>
           <w:tcPr>
             <w:tcW w:w="2400" w:type="dxa"/>
@@ -4567,12 +4069,6 @@
         </w:tc>
       </w:tr>
       <w:tr>
-        <w:tblPrEx>
-          <w:tblCellMar>
-            <w:top w:w="0" w:type="dxa"/>
-            <w:bottom w:w="0" w:type="dxa"/>
-          </w:tblCellMar>
-        </w:tblPrEx>
         <w:tc>
           <w:tcPr>
             <w:tcW w:w="2400" w:type="dxa"/>
@@ -4611,12 +4107,6 @@
         </w:tc>
       </w:tr>
       <w:tr>
-        <w:tblPrEx>
-          <w:tblCellMar>
-            <w:top w:w="0" w:type="dxa"/>
-            <w:bottom w:w="0" w:type="dxa"/>
-          </w:tblCellMar>
-        </w:tblPrEx>
         <w:tc>
           <w:tcPr>
             <w:tcW w:w="2400" w:type="dxa"/>
@@ -4651,12 +4141,6 @@
         </w:tc>
       </w:tr>
       <w:tr>
-        <w:tblPrEx>
-          <w:tblCellMar>
-            <w:top w:w="0" w:type="dxa"/>
-            <w:bottom w:w="0" w:type="dxa"/>
-          </w:tblCellMar>
-        </w:tblPrEx>
         <w:tc>
           <w:tcPr>
             <w:tcW w:w="2400" w:type="dxa"/>
@@ -4695,12 +4179,6 @@
         </w:tc>
       </w:tr>
       <w:tr>
-        <w:tblPrEx>
-          <w:tblCellMar>
-            <w:top w:w="0" w:type="dxa"/>
-            <w:bottom w:w="0" w:type="dxa"/>
-          </w:tblCellMar>
-        </w:tblPrEx>
         <w:tc>
           <w:tcPr>
             <w:tcW w:w="2400" w:type="dxa"/>
@@ -4735,12 +4213,6 @@
         </w:tc>
       </w:tr>
       <w:tr>
-        <w:tblPrEx>
-          <w:tblCellMar>
-            <w:top w:w="0" w:type="dxa"/>
-            <w:bottom w:w="0" w:type="dxa"/>
-          </w:tblCellMar>
-        </w:tblPrEx>
         <w:tc>
           <w:tcPr>
             <w:tcW w:w="2400" w:type="dxa"/>
@@ -4779,12 +4251,6 @@
         </w:tc>
       </w:tr>
       <w:tr>
-        <w:tblPrEx>
-          <w:tblCellMar>
-            <w:top w:w="0" w:type="dxa"/>
-            <w:bottom w:w="0" w:type="dxa"/>
-          </w:tblCellMar>
-        </w:tblPrEx>
         <w:tc>
           <w:tcPr>
             <w:tcW w:w="2400" w:type="dxa"/>
@@ -4821,12 +4287,6 @@
         </w:tc>
       </w:tr>
       <w:tr>
-        <w:tblPrEx>
-          <w:tblCellMar>
-            <w:top w:w="0" w:type="dxa"/>
-            <w:bottom w:w="0" w:type="dxa"/>
-          </w:tblCellMar>
-        </w:tblPrEx>
         <w:tc>
           <w:tcPr>
             <w:tcW w:w="2400" w:type="dxa"/>
@@ -4867,12 +4327,6 @@
         </w:tc>
       </w:tr>
       <w:tr>
-        <w:tblPrEx>
-          <w:tblCellMar>
-            <w:top w:w="0" w:type="dxa"/>
-            <w:bottom w:w="0" w:type="dxa"/>
-          </w:tblCellMar>
-        </w:tblPrEx>
         <w:tc>
           <w:tcPr>
             <w:tcW w:w="2400" w:type="dxa"/>
@@ -4909,12 +4363,6 @@
         </w:tc>
       </w:tr>
       <w:tr>
-        <w:tblPrEx>
-          <w:tblCellMar>
-            <w:top w:w="0" w:type="dxa"/>
-            <w:bottom w:w="0" w:type="dxa"/>
-          </w:tblCellMar>
-        </w:tblPrEx>
         <w:tc>
           <w:tcPr>
             <w:tcW w:w="2400" w:type="dxa"/>
@@ -5005,12 +4453,6 @@
         <w:gridCol w:w="3360"/>
       </w:tblGrid>
       <w:tr>
-        <w:tblPrEx>
-          <w:tblCellMar>
-            <w:top w:w="0" w:type="dxa"/>
-            <w:bottom w:w="0" w:type="dxa"/>
-          </w:tblCellMar>
-        </w:tblPrEx>
         <w:trPr>
           <w:tblHeader/>
         </w:trPr>
@@ -5080,12 +4522,6 @@
         </w:tc>
       </w:tr>
       <w:tr>
-        <w:tblPrEx>
-          <w:tblCellMar>
-            <w:top w:w="0" w:type="dxa"/>
-            <w:bottom w:w="0" w:type="dxa"/>
-          </w:tblCellMar>
-        </w:tblPrEx>
         <w:tc>
           <w:tcPr>
             <w:tcW w:w="2400" w:type="dxa"/>
@@ -5128,12 +4564,6 @@
         </w:tc>
       </w:tr>
       <w:tr>
-        <w:tblPrEx>
-          <w:tblCellMar>
-            <w:top w:w="0" w:type="dxa"/>
-            <w:bottom w:w="0" w:type="dxa"/>
-          </w:tblCellMar>
-        </w:tblPrEx>
         <w:tc>
           <w:tcPr>
             <w:tcW w:w="2400" w:type="dxa"/>
@@ -5184,12 +4614,6 @@
         </w:tc>
       </w:tr>
       <w:tr>
-        <w:tblPrEx>
-          <w:tblCellMar>
-            <w:top w:w="0" w:type="dxa"/>
-            <w:bottom w:w="0" w:type="dxa"/>
-          </w:tblCellMar>
-        </w:tblPrEx>
         <w:tc>
           <w:tcPr>
             <w:tcW w:w="2400" w:type="dxa"/>
@@ -5236,12 +4660,6 @@
         </w:tc>
       </w:tr>
       <w:tr>
-        <w:tblPrEx>
-          <w:tblCellMar>
-            <w:top w:w="0" w:type="dxa"/>
-            <w:bottom w:w="0" w:type="dxa"/>
-          </w:tblCellMar>
-        </w:tblPrEx>
         <w:tc>
           <w:tcPr>
             <w:tcW w:w="2400" w:type="dxa"/>
@@ -5292,12 +4710,6 @@
         </w:tc>
       </w:tr>
       <w:tr>
-        <w:tblPrEx>
-          <w:tblCellMar>
-            <w:top w:w="0" w:type="dxa"/>
-            <w:bottom w:w="0" w:type="dxa"/>
-          </w:tblCellMar>
-        </w:tblPrEx>
         <w:tc>
           <w:tcPr>
             <w:tcW w:w="2400" w:type="dxa"/>
@@ -5336,12 +4748,6 @@
         </w:tc>
       </w:tr>
       <w:tr>
-        <w:tblPrEx>
-          <w:tblCellMar>
-            <w:top w:w="0" w:type="dxa"/>
-            <w:bottom w:w="0" w:type="dxa"/>
-          </w:tblCellMar>
-        </w:tblPrEx>
         <w:tc>
           <w:tcPr>
             <w:tcW w:w="2400" w:type="dxa"/>
@@ -5389,12 +4795,6 @@
         </w:tc>
       </w:tr>
       <w:tr>
-        <w:tblPrEx>
-          <w:tblCellMar>
-            <w:top w:w="0" w:type="dxa"/>
-            <w:bottom w:w="0" w:type="dxa"/>
-          </w:tblCellMar>
-        </w:tblPrEx>
         <w:tc>
           <w:tcPr>
             <w:tcW w:w="2400" w:type="dxa"/>
@@ -5429,12 +4829,6 @@
         </w:tc>
       </w:tr>
       <w:tr>
-        <w:tblPrEx>
-          <w:tblCellMar>
-            <w:top w:w="0" w:type="dxa"/>
-            <w:bottom w:w="0" w:type="dxa"/>
-          </w:tblCellMar>
-        </w:tblPrEx>
         <w:tc>
           <w:tcPr>
             <w:tcW w:w="2400" w:type="dxa"/>
@@ -5475,12 +4869,6 @@
         </w:tc>
       </w:tr>
       <w:tr>
-        <w:tblPrEx>
-          <w:tblCellMar>
-            <w:top w:w="0" w:type="dxa"/>
-            <w:bottom w:w="0" w:type="dxa"/>
-          </w:tblCellMar>
-        </w:tblPrEx>
         <w:tc>
           <w:tcPr>
             <w:tcW w:w="2400" w:type="dxa"/>
@@ -5519,12 +4907,6 @@
         </w:tc>
       </w:tr>
       <w:tr>
-        <w:tblPrEx>
-          <w:tblCellMar>
-            <w:top w:w="0" w:type="dxa"/>
-            <w:bottom w:w="0" w:type="dxa"/>
-          </w:tblCellMar>
-        </w:tblPrEx>
         <w:tc>
           <w:tcPr>
             <w:tcW w:w="2400" w:type="dxa"/>
@@ -5563,12 +4945,6 @@
         </w:tc>
       </w:tr>
       <w:tr>
-        <w:tblPrEx>
-          <w:tblCellMar>
-            <w:top w:w="0" w:type="dxa"/>
-            <w:bottom w:w="0" w:type="dxa"/>
-          </w:tblCellMar>
-        </w:tblPrEx>
         <w:tc>
           <w:tcPr>
             <w:tcW w:w="2400" w:type="dxa"/>
@@ -5605,12 +4981,6 @@
         </w:tc>
       </w:tr>
       <w:tr>
-        <w:tblPrEx>
-          <w:tblCellMar>
-            <w:top w:w="0" w:type="dxa"/>
-            <w:bottom w:w="0" w:type="dxa"/>
-          </w:tblCellMar>
-        </w:tblPrEx>
         <w:tc>
           <w:tcPr>
             <w:tcW w:w="2400" w:type="dxa"/>
@@ -5653,12 +5023,6 @@
         </w:tc>
       </w:tr>
       <w:tr>
-        <w:tblPrEx>
-          <w:tblCellMar>
-            <w:top w:w="0" w:type="dxa"/>
-            <w:bottom w:w="0" w:type="dxa"/>
-          </w:tblCellMar>
-        </w:tblPrEx>
         <w:tc>
           <w:tcPr>
             <w:tcW w:w="2400" w:type="dxa"/>
@@ -5693,12 +5057,6 @@
         </w:tc>
       </w:tr>
       <w:tr>
-        <w:tblPrEx>
-          <w:tblCellMar>
-            <w:top w:w="0" w:type="dxa"/>
-            <w:bottom w:w="0" w:type="dxa"/>
-          </w:tblCellMar>
-        </w:tblPrEx>
         <w:tc>
           <w:tcPr>
             <w:tcW w:w="2400" w:type="dxa"/>
@@ -5748,12 +5106,6 @@
         </w:tc>
       </w:tr>
       <w:tr>
-        <w:tblPrEx>
-          <w:tblCellMar>
-            <w:top w:w="0" w:type="dxa"/>
-            <w:bottom w:w="0" w:type="dxa"/>
-          </w:tblCellMar>
-        </w:tblPrEx>
         <w:tc>
           <w:tcPr>
             <w:tcW w:w="2400" w:type="dxa"/>
@@ -5792,12 +5144,6 @@
         </w:tc>
       </w:tr>
       <w:tr>
-        <w:tblPrEx>
-          <w:tblCellMar>
-            <w:top w:w="0" w:type="dxa"/>
-            <w:bottom w:w="0" w:type="dxa"/>
-          </w:tblCellMar>
-        </w:tblPrEx>
         <w:tc>
           <w:tcPr>
             <w:tcW w:w="2400" w:type="dxa"/>
@@ -5842,12 +5188,6 @@
         </w:tc>
       </w:tr>
       <w:tr>
-        <w:tblPrEx>
-          <w:tblCellMar>
-            <w:top w:w="0" w:type="dxa"/>
-            <w:bottom w:w="0" w:type="dxa"/>
-          </w:tblCellMar>
-        </w:tblPrEx>
         <w:tc>
           <w:tcPr>
             <w:tcW w:w="2400" w:type="dxa"/>
@@ -5888,12 +5228,6 @@
         </w:tc>
       </w:tr>
       <w:tr>
-        <w:tblPrEx>
-          <w:tblCellMar>
-            <w:top w:w="0" w:type="dxa"/>
-            <w:bottom w:w="0" w:type="dxa"/>
-          </w:tblCellMar>
-        </w:tblPrEx>
         <w:tc>
           <w:tcPr>
             <w:tcW w:w="2400" w:type="dxa"/>
@@ -5982,12 +5316,6 @@
         <w:gridCol w:w="3360"/>
       </w:tblGrid>
       <w:tr>
-        <w:tblPrEx>
-          <w:tblCellMar>
-            <w:top w:w="0" w:type="dxa"/>
-            <w:bottom w:w="0" w:type="dxa"/>
-          </w:tblCellMar>
-        </w:tblPrEx>
         <w:trPr>
           <w:tblHeader/>
         </w:trPr>
@@ -6057,12 +5385,6 @@
         </w:tc>
       </w:tr>
       <w:tr>
-        <w:tblPrEx>
-          <w:tblCellMar>
-            <w:top w:w="0" w:type="dxa"/>
-            <w:bottom w:w="0" w:type="dxa"/>
-          </w:tblCellMar>
-        </w:tblPrEx>
         <w:tc>
           <w:tcPr>
             <w:tcW w:w="2400" w:type="dxa"/>
@@ -6103,12 +5425,6 @@
         </w:tc>
       </w:tr>
       <w:tr>
-        <w:tblPrEx>
-          <w:tblCellMar>
-            <w:top w:w="0" w:type="dxa"/>
-            <w:bottom w:w="0" w:type="dxa"/>
-          </w:tblCellMar>
-        </w:tblPrEx>
         <w:tc>
           <w:tcPr>
             <w:tcW w:w="2400" w:type="dxa"/>
@@ -6189,12 +5505,6 @@
         <w:gridCol w:w="3360"/>
       </w:tblGrid>
       <w:tr>
-        <w:tblPrEx>
-          <w:tblCellMar>
-            <w:top w:w="0" w:type="dxa"/>
-            <w:bottom w:w="0" w:type="dxa"/>
-          </w:tblCellMar>
-        </w:tblPrEx>
         <w:trPr>
           <w:tblHeader/>
         </w:trPr>
@@ -6264,12 +5574,6 @@
         </w:tc>
       </w:tr>
       <w:tr>
-        <w:tblPrEx>
-          <w:tblCellMar>
-            <w:top w:w="0" w:type="dxa"/>
-            <w:bottom w:w="0" w:type="dxa"/>
-          </w:tblCellMar>
-        </w:tblPrEx>
         <w:tc>
           <w:tcPr>
             <w:tcW w:w="2400" w:type="dxa"/>
@@ -6312,12 +5616,6 @@
         </w:tc>
       </w:tr>
       <w:tr>
-        <w:tblPrEx>
-          <w:tblCellMar>
-            <w:top w:w="0" w:type="dxa"/>
-            <w:bottom w:w="0" w:type="dxa"/>
-          </w:tblCellMar>
-        </w:tblPrEx>
         <w:tc>
           <w:tcPr>
             <w:tcW w:w="2400" w:type="dxa"/>
@@ -6368,12 +5666,6 @@
         </w:tc>
       </w:tr>
       <w:tr>
-        <w:tblPrEx>
-          <w:tblCellMar>
-            <w:top w:w="0" w:type="dxa"/>
-            <w:bottom w:w="0" w:type="dxa"/>
-          </w:tblCellMar>
-        </w:tblPrEx>
         <w:tc>
           <w:tcPr>
             <w:tcW w:w="2400" w:type="dxa"/>
@@ -6420,12 +5712,6 @@
         </w:tc>
       </w:tr>
       <w:tr>
-        <w:tblPrEx>
-          <w:tblCellMar>
-            <w:top w:w="0" w:type="dxa"/>
-            <w:bottom w:w="0" w:type="dxa"/>
-          </w:tblCellMar>
-        </w:tblPrEx>
         <w:tc>
           <w:tcPr>
             <w:tcW w:w="2400" w:type="dxa"/>
@@ -6476,12 +5762,6 @@
         </w:tc>
       </w:tr>
       <w:tr>
-        <w:tblPrEx>
-          <w:tblCellMar>
-            <w:top w:w="0" w:type="dxa"/>
-            <w:bottom w:w="0" w:type="dxa"/>
-          </w:tblCellMar>
-        </w:tblPrEx>
         <w:tc>
           <w:tcPr>
             <w:tcW w:w="2400" w:type="dxa"/>
@@ -6518,12 +5798,6 @@
         </w:tc>
       </w:tr>
       <w:tr>
-        <w:tblPrEx>
-          <w:tblCellMar>
-            <w:top w:w="0" w:type="dxa"/>
-            <w:bottom w:w="0" w:type="dxa"/>
-          </w:tblCellMar>
-        </w:tblPrEx>
         <w:tc>
           <w:tcPr>
             <w:tcW w:w="2400" w:type="dxa"/>
@@ -6564,12 +5838,6 @@
         </w:tc>
       </w:tr>
       <w:tr>
-        <w:tblPrEx>
-          <w:tblCellMar>
-            <w:top w:w="0" w:type="dxa"/>
-            <w:bottom w:w="0" w:type="dxa"/>
-          </w:tblCellMar>
-        </w:tblPrEx>
         <w:tc>
           <w:tcPr>
             <w:tcW w:w="2400" w:type="dxa"/>
@@ -6604,12 +5872,6 @@
         </w:tc>
       </w:tr>
       <w:tr>
-        <w:tblPrEx>
-          <w:tblCellMar>
-            <w:top w:w="0" w:type="dxa"/>
-            <w:bottom w:w="0" w:type="dxa"/>
-          </w:tblCellMar>
-        </w:tblPrEx>
         <w:tc>
           <w:tcPr>
             <w:tcW w:w="2400" w:type="dxa"/>
@@ -6650,12 +5912,6 @@
         </w:tc>
       </w:tr>
       <w:tr>
-        <w:tblPrEx>
-          <w:tblCellMar>
-            <w:top w:w="0" w:type="dxa"/>
-            <w:bottom w:w="0" w:type="dxa"/>
-          </w:tblCellMar>
-        </w:tblPrEx>
         <w:tc>
           <w:tcPr>
             <w:tcW w:w="2400" w:type="dxa"/>
@@ -6694,12 +5950,6 @@
         </w:tc>
       </w:tr>
       <w:tr>
-        <w:tblPrEx>
-          <w:tblCellMar>
-            <w:top w:w="0" w:type="dxa"/>
-            <w:bottom w:w="0" w:type="dxa"/>
-          </w:tblCellMar>
-        </w:tblPrEx>
         <w:tc>
           <w:tcPr>
             <w:tcW w:w="2400" w:type="dxa"/>
@@ -6740,12 +5990,6 @@
         </w:tc>
       </w:tr>
       <w:tr>
-        <w:tblPrEx>
-          <w:tblCellMar>
-            <w:top w:w="0" w:type="dxa"/>
-            <w:bottom w:w="0" w:type="dxa"/>
-          </w:tblCellMar>
-        </w:tblPrEx>
         <w:tc>
           <w:tcPr>
             <w:tcW w:w="2400" w:type="dxa"/>
@@ -6782,12 +6026,6 @@
         </w:tc>
       </w:tr>
       <w:tr>
-        <w:tblPrEx>
-          <w:tblCellMar>
-            <w:top w:w="0" w:type="dxa"/>
-            <w:bottom w:w="0" w:type="dxa"/>
-          </w:tblCellMar>
-        </w:tblPrEx>
         <w:tc>
           <w:tcPr>
             <w:tcW w:w="2400" w:type="dxa"/>
@@ -6826,12 +6064,6 @@
         </w:tc>
       </w:tr>
       <w:tr>
-        <w:tblPrEx>
-          <w:tblCellMar>
-            <w:top w:w="0" w:type="dxa"/>
-            <w:bottom w:w="0" w:type="dxa"/>
-          </w:tblCellMar>
-        </w:tblPrEx>
         <w:tc>
           <w:tcPr>
             <w:tcW w:w="2400" w:type="dxa"/>
@@ -6866,12 +6098,6 @@
         </w:tc>
       </w:tr>
       <w:tr>
-        <w:tblPrEx>
-          <w:tblCellMar>
-            <w:top w:w="0" w:type="dxa"/>
-            <w:bottom w:w="0" w:type="dxa"/>
-          </w:tblCellMar>
-        </w:tblPrEx>
         <w:tc>
           <w:tcPr>
             <w:tcW w:w="2400" w:type="dxa"/>
@@ -6912,12 +6138,6 @@
         </w:tc>
       </w:tr>
       <w:tr>
-        <w:tblPrEx>
-          <w:tblCellMar>
-            <w:top w:w="0" w:type="dxa"/>
-            <w:bottom w:w="0" w:type="dxa"/>
-          </w:tblCellMar>
-        </w:tblPrEx>
         <w:tc>
           <w:tcPr>
             <w:tcW w:w="2400" w:type="dxa"/>
@@ -6954,12 +6174,6 @@
         </w:tc>
       </w:tr>
       <w:tr>
-        <w:tblPrEx>
-          <w:tblCellMar>
-            <w:top w:w="0" w:type="dxa"/>
-            <w:bottom w:w="0" w:type="dxa"/>
-          </w:tblCellMar>
-        </w:tblPrEx>
         <w:tc>
           <w:tcPr>
             <w:tcW w:w="2400" w:type="dxa"/>
@@ -7008,12 +6222,6 @@
         </w:tc>
       </w:tr>
       <w:tr>
-        <w:tblPrEx>
-          <w:tblCellMar>
-            <w:top w:w="0" w:type="dxa"/>
-            <w:bottom w:w="0" w:type="dxa"/>
-          </w:tblCellMar>
-        </w:tblPrEx>
         <w:tc>
           <w:tcPr>
             <w:tcW w:w="2400" w:type="dxa"/>
@@ -7082,12 +6290,6 @@
         <w:gridCol w:w="3360"/>
       </w:tblGrid>
       <w:tr>
-        <w:tblPrEx>
-          <w:tblCellMar>
-            <w:top w:w="0" w:type="dxa"/>
-            <w:bottom w:w="0" w:type="dxa"/>
-          </w:tblCellMar>
-        </w:tblPrEx>
         <w:trPr>
           <w:tblHeader/>
         </w:trPr>
@@ -7157,12 +6359,6 @@
         </w:tc>
       </w:tr>
       <w:tr>
-        <w:tblPrEx>
-          <w:tblCellMar>
-            <w:top w:w="0" w:type="dxa"/>
-            <w:bottom w:w="0" w:type="dxa"/>
-          </w:tblCellMar>
-        </w:tblPrEx>
         <w:tc>
           <w:tcPr>
             <w:tcW w:w="2400" w:type="dxa"/>
@@ -7205,12 +6401,6 @@
         </w:tc>
       </w:tr>
       <w:tr>
-        <w:tblPrEx>
-          <w:tblCellMar>
-            <w:top w:w="0" w:type="dxa"/>
-            <w:bottom w:w="0" w:type="dxa"/>
-          </w:tblCellMar>
-        </w:tblPrEx>
         <w:tc>
           <w:tcPr>
             <w:tcW w:w="2400" w:type="dxa"/>
@@ -7256,9 +6446,49 @@
       </w:tr>
     </w:tbl>
     <w:p>
-      <w:pPr>
-        <w:spacing w:after="200"/>
-      </w:pPr>
+      <w:proofErr w:type="spellStart"/>
+      <w:r>
+        <w:rPr>
+          <w:b/>
+          <w:bCs/>
+        </w:rPr>
+        <w:lastRenderedPageBreak/>
+        <w:t>position_text</w:t>
+      </w:r>
+      <w:proofErr w:type="spellEnd"/>
+      <w:r>
+        <w:t>:</w:t>
+      </w:r>
+    </w:p>
+    <w:p>
+      <w:r>
+        <w:t>D: Disqualified</w:t>
+      </w:r>
+    </w:p>
+    <w:p>
+      <w:r>
+        <w:t>E: Excluded</w:t>
+      </w:r>
+    </w:p>
+    <w:p>
+      <w:r>
+        <w:t>F: Failed to qualify</w:t>
+      </w:r>
+    </w:p>
+    <w:p>
+      <w:r>
+        <w:t>N: Not classified</w:t>
+      </w:r>
+    </w:p>
+    <w:p>
+      <w:r>
+        <w:t>R: Retired</w:t>
+      </w:r>
+    </w:p>
+    <w:p>
+      <w:r>
+        <w:t>W: Withdrawn</w:t>
+      </w:r>
     </w:p>
     <w:sectPr>
       <w:pgSz w:w="12240" w:h="15840"/>
@@ -7847,7 +7077,6 @@
   <w:style w:type="character" w:default="1" w:styleId="DefaultParagraphFont">
     <w:name w:val="Default Paragraph Font"/>
     <w:uiPriority w:val="1"/>
-    <w:semiHidden/>
     <w:unhideWhenUsed/>
   </w:style>
   <w:style w:type="table" w:default="1" w:styleId="TableNormal">

</xml_diff>